<commit_message>
Fix affichage ST sur tous les PE
ST placé sur la première cellule visible de chaque bloc lahasa
(au lieu de la cellule vMerge continue invisible).

Co-authored-by: arena-agent <297053741+arena-agent@users.noreply.github.com>
</commit_message>
<xml_diff>
--- a/PE-FCE-2026-2027.docx
+++ b/PE-FCE-2026-2027.docx
@@ -972,6 +972,35 @@
               <w:t>FCE</w:t>
             </w:r>
           </w:p>
+          <w:p>
+            <w:pPr>
+              <w:spacing w:before="0" w:after="0" w:line="240" w:lineRule="auto"/>
+              <w:jc w:val="center"/>
+            </w:pPr>
+            <w:r>
+              <w:rPr>
+                <w:rFonts w:ascii="Times New Roman" w:hAnsi="Times New Roman" w:eastAsia="Times New Roman" w:cs="Times New Roman"/>
+                <w:b w:val="0"/>
+                <w:i w:val="0"/>
+                <w:sz w:val="22"/>
+              </w:rPr>
+            </w:r>
+          </w:p>
+          <w:p>
+            <w:pPr>
+              <w:spacing w:before="0" w:after="0" w:line="240" w:lineRule="auto"/>
+              <w:jc w:val="center"/>
+            </w:pPr>
+            <w:r>
+              <w:rPr>
+                <w:rFonts w:ascii="Times New Roman" w:hAnsi="Times New Roman" w:eastAsia="Times New Roman" w:cs="Times New Roman"/>
+                <w:b/>
+                <w:i/>
+                <w:sz w:val="22"/>
+              </w:rPr>
+              <w:t>ST : 144 800</w:t>
+            </w:r>
+          </w:p>
         </w:tc>
         <w:tc>
           <w:tcPr>
@@ -1761,11 +1790,10 @@
             <w:r>
               <w:rPr>
                 <w:rFonts w:ascii="Times New Roman" w:hAnsi="Times New Roman" w:eastAsia="Times New Roman" w:cs="Times New Roman"/>
-                <w:b/>
-                <w:i/>
+                <w:b w:val="0"/>
+                <w:i w:val="0"/>
                 <w:sz w:val="22"/>
               </w:rPr>
-              <w:t>ST : 144 800</w:t>
             </w:r>
           </w:p>
         </w:tc>
@@ -2033,6 +2061,35 @@
                 <w:sz w:val="22"/>
               </w:rPr>
               <w:t>FCE</w:t>
+            </w:r>
+          </w:p>
+          <w:p>
+            <w:pPr>
+              <w:spacing w:before="0" w:after="0" w:line="240" w:lineRule="auto"/>
+              <w:jc w:val="center"/>
+            </w:pPr>
+            <w:r>
+              <w:rPr>
+                <w:rFonts w:ascii="Times New Roman" w:hAnsi="Times New Roman" w:eastAsia="Times New Roman" w:cs="Times New Roman"/>
+                <w:b w:val="0"/>
+                <w:i w:val="0"/>
+                <w:sz w:val="22"/>
+              </w:rPr>
+            </w:r>
+          </w:p>
+          <w:p>
+            <w:pPr>
+              <w:spacing w:before="0" w:after="0" w:line="240" w:lineRule="auto"/>
+              <w:jc w:val="center"/>
+            </w:pPr>
+            <w:r>
+              <w:rPr>
+                <w:rFonts w:ascii="Times New Roman" w:hAnsi="Times New Roman" w:eastAsia="Times New Roman" w:cs="Times New Roman"/>
+                <w:b/>
+                <w:i/>
+                <w:sz w:val="22"/>
+              </w:rPr>
+              <w:t>ST : 78 000</w:t>
             </w:r>
           </w:p>
         </w:tc>
@@ -2559,11 +2616,10 @@
             <w:r>
               <w:rPr>
                 <w:rFonts w:ascii="Times New Roman" w:hAnsi="Times New Roman" w:eastAsia="Times New Roman" w:cs="Times New Roman"/>
-                <w:b/>
-                <w:i/>
+                <w:b w:val="0"/>
+                <w:i w:val="0"/>
                 <w:sz w:val="22"/>
               </w:rPr>
-              <w:t>ST : 78 000</w:t>
             </w:r>
           </w:p>
         </w:tc>
@@ -2831,6 +2887,35 @@
                 <w:sz w:val="22"/>
               </w:rPr>
               <w:t>FCE</w:t>
+            </w:r>
+          </w:p>
+          <w:p>
+            <w:pPr>
+              <w:spacing w:before="0" w:after="0" w:line="240" w:lineRule="auto"/>
+              <w:jc w:val="center"/>
+            </w:pPr>
+            <w:r>
+              <w:rPr>
+                <w:rFonts w:ascii="Times New Roman" w:hAnsi="Times New Roman" w:eastAsia="Times New Roman" w:cs="Times New Roman"/>
+                <w:b w:val="0"/>
+                <w:i w:val="0"/>
+                <w:sz w:val="22"/>
+              </w:rPr>
+            </w:r>
+          </w:p>
+          <w:p>
+            <w:pPr>
+              <w:spacing w:before="0" w:after="0" w:line="240" w:lineRule="auto"/>
+              <w:jc w:val="center"/>
+            </w:pPr>
+            <w:r>
+              <w:rPr>
+                <w:rFonts w:ascii="Times New Roman" w:hAnsi="Times New Roman" w:eastAsia="Times New Roman" w:cs="Times New Roman"/>
+                <w:b/>
+                <w:i/>
+                <w:sz w:val="22"/>
+              </w:rPr>
+              <w:t>ST : 110 200</w:t>
             </w:r>
           </w:p>
         </w:tc>
@@ -4947,11 +5032,10 @@
             <w:r>
               <w:rPr>
                 <w:rFonts w:ascii="Times New Roman" w:hAnsi="Times New Roman" w:eastAsia="Times New Roman" w:cs="Times New Roman"/>
-                <w:b/>
-                <w:i/>
+                <w:b w:val="0"/>
+                <w:i w:val="0"/>
                 <w:sz w:val="22"/>
               </w:rPr>
-              <w:t>ST : 110 200</w:t>
             </w:r>
           </w:p>
         </w:tc>
@@ -5217,6 +5301,20 @@
                 <w:sz w:val="22"/>
               </w:rPr>
               <w:t>FCE</w:t>
+            </w:r>
+          </w:p>
+          <w:p>
+            <w:pPr>
+              <w:spacing w:before="0" w:after="0" w:line="240" w:lineRule="auto"/>
+              <w:jc w:val="center"/>
+            </w:pPr>
+            <w:r>
+              <w:rPr>
+                <w:rFonts w:ascii="Times New Roman" w:hAnsi="Times New Roman" w:eastAsia="Times New Roman" w:cs="Times New Roman"/>
+                <w:b w:val="0"/>
+                <w:i w:val="0"/>
+                <w:sz w:val="22"/>
+              </w:rPr>
             </w:r>
           </w:p>
           <w:p>

</xml_diff>